<commit_message>
Switch primary + sensitivity exposures from eGFR ratio to eGFR difference (%)
Primary predictor egfr_diff_pct = 100 * (CKD-EPI Cr-Cys unindexed - CG) / CG,
reported per 10 percentage-point decline. Sensitivity predictor
egfr_diff_pct_sens = 100 * (CKD-EPI 2012 CysC - CKD-EPI 2021 Cr) / CKD-EPI 2021 Cr,
also per 10 % decline. Old egfr_ratio/egfr_ratio_sens derivations retained
in Section 1 setup but unused downstream. Whole cohort gets a new Section 3.3
distribution histogram; Section 3.2 mL/min discordance histogram and the
mL/min discrepancy analysis sections (Section 7 whole; Section 10 carbo/AUC3)
remain unchanged as parallel comparisons.

Co-Authored-By: Claude Opus 4.7 (1M context) <noreply@anthropic.com>
</commit_message>
<xml_diff>
--- a/docs/tables/auc3/sec5_death_90.docx
+++ b/docs/tables/auc3/sec5_death_90.docx
@@ -785,7 +785,7 @@
                 <w:szCs w:val="22"/>
                 <w:color w:val="000000"/>
               </w:rPr>
-              <w:t xml:space="preserve">egfr_ratio_per10</w:t>
+              <w:t xml:space="preserve">egfr_diff_pct_per10</w:t>
             </w:r>
           </w:p>
         </w:tc>
@@ -10280,7 +10280,7 @@
                 <w:szCs w:val="22"/>
                 <w:color w:val="000000"/>
               </w:rPr>
-              <w:t xml:space="preserve">418,108,990</w:t>
+              <w:t xml:space="preserve">418,108,980</w:t>
             </w:r>
           </w:p>
         </w:tc>
@@ -15110,7 +15110,7 @@
                 <w:szCs w:val="22"/>
                 <w:color w:val="000000"/>
               </w:rPr>
-              <w:t xml:space="preserve">991,948,253</w:t>
+              <w:t xml:space="preserve">991,947,896</w:t>
             </w:r>
           </w:p>
         </w:tc>

</xml_diff>